<commit_message>
docs/sales: sharpen the Birmingham refugee-team intro email (punchy, executive)
Tightened to ~170 words: hook-led open covering new arrivals and
second-generation, four hard outcome bullets, one clear 20-minute ask.
Same StudYear branding.
</commit_message>
<xml_diff>
--- a/docs/sales/StudYear-Birmingham-Refugee-Migration-Team-Intro-Email.docx
+++ b/docs/sales/StudYear-Birmingham-Refugee-Migration-Team-Intro-Email.docx
@@ -93,7 +93,7 @@
           <w:szCs w:val="21"/>
           <w:rFonts w:ascii="Calibri" w:cs="Calibri" w:eastAsia="Calibri" w:hAnsi="Calibri"/>
         </w:rPr>
-        <w:t xml:space="preserve">A free learning tool for Birmingham’s new-arrival and migrant-background children</w:t>
+        <w:t xml:space="preserve">A personal tutor for every migrant-background child in Birmingham — free</w:t>
       </w:r>
     </w:p>
     <w:p>
@@ -107,7 +107,7 @@
           <w:szCs w:val="21"/>
           <w:rFonts w:ascii="Calibri" w:cs="Calibri" w:eastAsia="Calibri" w:hAnsi="Calibri"/>
         </w:rPr>
-        <w:t xml:space="preserve">Closing the attainment gap for the children your team supports — at no cost to families</w:t>
+        <w:t xml:space="preserve">Close the gap your team fights — on a phone, at no cost to families</w:t>
       </w:r>
     </w:p>
     <w:p>
@@ -121,7 +121,7 @@
           <w:szCs w:val="21"/>
           <w:rFonts w:ascii="Calibri" w:cs="Calibri" w:eastAsia="Calibri" w:hAnsi="Calibri"/>
         </w:rPr>
-        <w:t xml:space="preserve">Helping newly-arrived pupils catch up, on any phone, whatever their starting point</w:t>
+        <w:t xml:space="preserve">Catch them up before they fall through — free, any phone</w:t>
       </w:r>
     </w:p>
     <w:p>
@@ -153,7 +153,7 @@
           <w:szCs w:val="21"/>
           <w:rFonts w:ascii="Calibri" w:cs="Calibri" w:eastAsia="Calibri" w:hAnsi="Calibri"/>
         </w:rPr>
-        <w:t xml:space="preserve">Dear [Name / Refugee &amp; Migration Team],</w:t>
+        <w:t xml:space="preserve">Dear [Name],</w:t>
       </w:r>
     </w:p>
     <w:p>
@@ -167,7 +167,18 @@
           <w:szCs w:val="21"/>
           <w:rFonts w:ascii="Calibri" w:cs="Calibri" w:eastAsia="Calibri" w:hAnsi="Calibri"/>
         </w:rPr>
-        <w:t xml:space="preserve">Your team supports some of Birmingham’s most capable but most disrupted learners — children arriving mid-year between two education systems, and UK-born children of migrant parents who are falling through the gap at home and at school. I’d like to show you a tool that reaches them directly, for free.</w:t>
+        <w:t xml:space="preserve">Many of the children your team supports arrive mid-year between two school systems, or grow up between two languages — and too many never catch up. </w:t>
+      </w:r>
+      <w:r>
+        <w:rPr>
+          <w:b/>
+          <w:bCs/>
+          <w:color w:val="0A1026"/>
+          <w:sz w:val="21"/>
+          <w:szCs w:val="21"/>
+          <w:rFonts w:ascii="Calibri" w:cs="Calibri" w:eastAsia="Calibri" w:hAnsi="Calibri"/>
+        </w:rPr>
+        <w:t xml:space="preserve">StudYear closes that gap. Free, on any phone.</w:t>
       </w:r>
     </w:p>
     <w:p>
@@ -181,7 +192,7 @@
           <w:szCs w:val="21"/>
           <w:rFonts w:ascii="Calibri" w:cs="Calibri" w:eastAsia="Calibri" w:hAnsi="Calibri"/>
         </w:rPr>
-        <w:t xml:space="preserve">StudYear is an AI tutor, examiner and revision strategist built for UK learners. It matters for the children you work with because it:</w:t>
+        <w:t xml:space="preserve">StudYear is an AI tutor and examiner for every UK learner. Four things that matter to your families:</w:t>
       </w:r>
     </w:p>
     <w:p>
@@ -202,16 +213,16 @@
           <w:szCs w:val="21"/>
           <w:rFonts w:ascii="Calibri" w:cs="Calibri" w:eastAsia="Calibri" w:hAnsi="Calibri"/>
         </w:rPr>
-        <w:t xml:space="preserve">Starts free, on any phone, with no school login</w:t>
-      </w:r>
-      <w:r>
-        <w:rPr>
-          <w:color w:val="1A1F2E"/>
-          <w:sz w:val="21"/>
-          <w:szCs w:val="21"/>
-          <w:rFonts w:ascii="Calibri" w:cs="Calibri" w:eastAsia="Calibri" w:hAnsi="Calibri"/>
-        </w:rPr>
-        <w:t xml:space="preserve"> — so a family reaches it regardless of status, income or whether a school place is settled yet.</w:t>
+        <w:t xml:space="preserve">Reaches anyone</w:t>
+      </w:r>
+      <w:r>
+        <w:rPr>
+          <w:color w:val="1A1F2E"/>
+          <w:sz w:val="21"/>
+          <w:szCs w:val="21"/>
+          <w:rFonts w:ascii="Calibri" w:cs="Calibri" w:eastAsia="Calibri" w:hAnsi="Calibri"/>
+        </w:rPr>
+        <w:t xml:space="preserve"> — free, any phone, no school login, whatever their status or income.</w:t>
       </w:r>
     </w:p>
     <w:p>
@@ -232,16 +243,16 @@
           <w:szCs w:val="21"/>
           <w:rFonts w:ascii="Calibri" w:cs="Calibri" w:eastAsia="Calibri" w:hAnsi="Calibri"/>
         </w:rPr>
-        <w:t xml:space="preserve">Meets a child at their real level and the right qualification</w:t>
-      </w:r>
-      <w:r>
-        <w:rPr>
-          <w:color w:val="1A1F2E"/>
-          <w:sz w:val="21"/>
-          <w:szCs w:val="21"/>
-          <w:rFonts w:ascii="Calibri" w:cs="Calibri" w:eastAsia="Calibri" w:hAnsi="Calibri"/>
-        </w:rPr>
-        <w:t xml:space="preserve"> — it works to the correct national framework (Primary through GCSE 9–1, A-level, BTEC, T-Level, NVQ and apprenticeships), so an older new arrival isn’t forced back to the wrong starting point.</w:t>
+        <w:t xml:space="preserve">Starts at the right level</w:t>
+      </w:r>
+      <w:r>
+        <w:rPr>
+          <w:color w:val="1A1F2E"/>
+          <w:sz w:val="21"/>
+          <w:szCs w:val="21"/>
+          <w:rFonts w:ascii="Calibri" w:cs="Calibri" w:eastAsia="Calibri" w:hAnsi="Calibri"/>
+        </w:rPr>
+        <w:t xml:space="preserve"> — it teaches to the correct national framework (GCSE 9–1, A-level, BTEC, T-Level, NVQ, apprenticeships), so an older new arrival isn’t sent back to the beginning.</w:t>
       </w:r>
     </w:p>
     <w:p>
@@ -262,16 +273,16 @@
           <w:szCs w:val="21"/>
           <w:rFonts w:ascii="Calibri" w:cs="Calibri" w:eastAsia="Calibri" w:hAnsi="Calibri"/>
         </w:rPr>
-        <w:t xml:space="preserve">Targets the exact gaps new arrivals face</w:t>
-      </w:r>
-      <w:r>
-        <w:rPr>
-          <w:color w:val="1A1F2E"/>
-          <w:sz w:val="21"/>
-          <w:szCs w:val="21"/>
-          <w:rFonts w:ascii="Calibri" w:cs="Calibri" w:eastAsia="Calibri" w:hAnsi="Calibri"/>
-        </w:rPr>
-        <w:t xml:space="preserve"> — English comprehension, spelling and writing level. A parent or teacher can photograph a child’s handwritten work and StudYear reads it, diagnoses what’s holding them back, and returns a step-by-step plan with short daily practice.</w:t>
+        <w:t xml:space="preserve">Fixes the real gap</w:t>
+      </w:r>
+      <w:r>
+        <w:rPr>
+          <w:color w:val="1A1F2E"/>
+          <w:sz w:val="21"/>
+          <w:szCs w:val="21"/>
+          <w:rFonts w:ascii="Calibri" w:cs="Calibri" w:eastAsia="Calibri" w:hAnsi="Calibri"/>
+        </w:rPr>
+        <w:t xml:space="preserve"> — photograph a child’s handwritten work; StudYear diagnoses English, spelling and writing level and returns a step-by-step daily plan.</w:t>
       </w:r>
     </w:p>
     <w:p>
@@ -292,27 +303,45 @@
           <w:szCs w:val="21"/>
           <w:rFonts w:ascii="Calibri" w:cs="Calibri" w:eastAsia="Calibri" w:hAnsi="Calibri"/>
         </w:rPr>
-        <w:t xml:space="preserve">Brings parents in from their own phone</w:t>
-      </w:r>
-      <w:r>
-        <w:rPr>
-          <w:color w:val="1A1F2E"/>
-          <w:sz w:val="21"/>
-          <w:szCs w:val="21"/>
-          <w:rFonts w:ascii="Calibri" w:cs="Calibri" w:eastAsia="Calibri" w:hAnsi="Calibri"/>
-        </w:rPr>
-        <w:t xml:space="preserve"> — in plain progress terms, no jargon, no school portal — which helps families new to the UK system stay involved.</w:t>
-      </w:r>
-    </w:p>
-    <w:p>
-      <w:pPr>
-        <w:pStyle w:val="ListParagraph"/>
-        <w:numPr>
-          <w:ilvl w:val="0"/>
-          <w:numId w:val="2"/>
-        </w:numPr>
-        <w:spacing w:after="120" w:line="270"/>
-      </w:pPr>
+        <w:t xml:space="preserve">Flags who’s slipping — early</w:t>
+      </w:r>
+      <w:r>
+        <w:rPr>
+          <w:color w:val="1A1F2E"/>
+          <w:sz w:val="21"/>
+          <w:szCs w:val="21"/>
+          <w:rFonts w:ascii="Calibri" w:cs="Calibri" w:eastAsia="Calibri" w:hAnsi="Calibri"/>
+        </w:rPr>
+        <w:t xml:space="preserve"> — a cohort view puts your support and funding where it counts, before a missed exam or a NEET statistic.</w:t>
+      </w:r>
+    </w:p>
+    <w:p>
+      <w:pPr>
+        <w:spacing w:after="160" w:line="276"/>
+      </w:pPr>
+      <w:r>
+        <w:rPr>
+          <w:color w:val="1A1F2E"/>
+          <w:sz w:val="21"/>
+          <w:szCs w:val="21"/>
+          <w:rFonts w:ascii="Calibri" w:cs="Calibri" w:eastAsia="Calibri" w:hAnsi="Calibri"/>
+        </w:rPr>
+        <w:t xml:space="preserve">Safe by design: UK-held data, built to the Children’s Code. Parents follow real progress from their own phone.</w:t>
+      </w:r>
+    </w:p>
+    <w:p>
+      <w:pPr>
+        <w:spacing w:after="160" w:line="276"/>
+      </w:pPr>
+      <w:r>
+        <w:rPr>
+          <w:color w:val="1A1F2E"/>
+          <w:sz w:val="21"/>
+          <w:szCs w:val="21"/>
+          <w:rFonts w:ascii="Calibri" w:cs="Calibri" w:eastAsia="Calibri" w:hAnsi="Calibri"/>
+        </w:rPr>
+        <w:t xml:space="preserve">The attached brief makes the full case. Give me </w:t>
+      </w:r>
       <w:r>
         <w:rPr>
           <w:b/>
@@ -322,84 +351,6 @@
           <w:szCs w:val="21"/>
           <w:rFonts w:ascii="Calibri" w:cs="Calibri" w:eastAsia="Calibri" w:hAnsi="Calibri"/>
         </w:rPr>
-        <w:t xml:space="preserve">Gives your team an early-warning view</w:t>
-      </w:r>
-      <w:r>
-        <w:rPr>
-          <w:color w:val="1A1F2E"/>
-          <w:sz w:val="21"/>
-          <w:szCs w:val="21"/>
-          <w:rFonts w:ascii="Calibri" w:cs="Calibri" w:eastAsia="Calibri" w:hAnsi="Calibri"/>
-        </w:rPr>
-        <w:t xml:space="preserve"> — so support and funding land on the children slipping before it shows up as a missed exam or a NEET statistic.</w:t>
-      </w:r>
-    </w:p>
-    <w:p>
-      <w:pPr>
-        <w:pStyle w:val="ListParagraph"/>
-        <w:numPr>
-          <w:ilvl w:val="0"/>
-          <w:numId w:val="2"/>
-        </w:numPr>
-        <w:spacing w:after="120" w:line="270"/>
-      </w:pPr>
-      <w:r>
-        <w:rPr>
-          <w:b/>
-          <w:bCs/>
-          <w:color w:val="0A1026"/>
-          <w:sz w:val="21"/>
-          <w:szCs w:val="21"/>
-          <w:rFonts w:ascii="Calibri" w:cs="Calibri" w:eastAsia="Calibri" w:hAnsi="Calibri"/>
-        </w:rPr>
-        <w:t xml:space="preserve">Is safe by design</w:t>
-      </w:r>
-      <w:r>
-        <w:rPr>
-          <w:color w:val="1A1F2E"/>
-          <w:sz w:val="21"/>
-          <w:szCs w:val="21"/>
-          <w:rFonts w:ascii="Calibri" w:cs="Calibri" w:eastAsia="Calibri" w:hAnsi="Calibri"/>
-        </w:rPr>
-        <w:t xml:space="preserve"> — UK-held data, built to the Children’s Code.</w:t>
-      </w:r>
-    </w:p>
-    <w:p>
-      <w:pPr>
-        <w:spacing w:after="160" w:line="276"/>
-      </w:pPr>
-      <w:r>
-        <w:rPr>
-          <w:color w:val="1A1F2E"/>
-          <w:sz w:val="21"/>
-          <w:szCs w:val="21"/>
-          <w:rFonts w:ascii="Calibri" w:cs="Calibri" w:eastAsia="Calibri" w:hAnsi="Calibri"/>
-        </w:rPr>
-        <w:t xml:space="preserve">The attached brief sets out the full picture — the need, how it works, and the impact for disadvantaged and migrant-background children now and into employment.</w:t>
-      </w:r>
-    </w:p>
-    <w:p>
-      <w:pPr>
-        <w:spacing w:after="160" w:line="276"/>
-      </w:pPr>
-      <w:r>
-        <w:rPr>
-          <w:color w:val="1A1F2E"/>
-          <w:sz w:val="21"/>
-          <w:szCs w:val="21"/>
-          <w:rFonts w:ascii="Calibri" w:cs="Calibri" w:eastAsia="Calibri" w:hAnsi="Calibri"/>
-        </w:rPr>
-        <w:t xml:space="preserve">Could I show you in </w:t>
-      </w:r>
-      <w:r>
-        <w:rPr>
-          <w:b/>
-          <w:bCs/>
-          <w:color w:val="0A1026"/>
-          <w:sz w:val="21"/>
-          <w:szCs w:val="21"/>
-          <w:rFonts w:ascii="Calibri" w:cs="Calibri" w:eastAsia="Calibri" w:hAnsi="Calibri"/>
-        </w:rPr>
         <w:t xml:space="preserve">20 minutes</w:t>
       </w:r>
       <w:r>
@@ -409,7 +360,7 @@
           <w:szCs w:val="21"/>
           <w:rFonts w:ascii="Calibri" w:cs="Calibri" w:eastAsia="Calibri" w:hAnsi="Calibri"/>
         </w:rPr>
-        <w:t xml:space="preserve">, with no preparation or obligation? You can also try it yourself first at </w:t>
+        <w:t xml:space="preserve"> — no prep, no cost, no obligation. Or see it yourself first: </w:t>
       </w:r>
       <w:r>
         <w:rPr>
@@ -443,7 +394,7 @@
           <w:szCs w:val="21"/>
           <w:rFonts w:ascii="Calibri" w:cs="Calibri" w:eastAsia="Calibri" w:hAnsi="Calibri"/>
         </w:rPr>
-        <w:t xml:space="preserve">With thanks for the work your team does,</w:t>
+        <w:t xml:space="preserve">With thanks for the work you do,</w:t>
       </w:r>
     </w:p>
     <w:p>

</xml_diff>

<commit_message>
docs/sales: Birmingham refugee-team email — keep the detail, add the USP
Restores the fuller, detailed version and adds a dedicated USP paragraph: the
differentiator is that StudYear is an AI examiner — it marks written work and
grades it to the correct national framework, showing the next step to the grade
above — not a chatbot. USP-forward subject option added.
</commit_message>
<xml_diff>
--- a/docs/sales/StudYear-Birmingham-Refugee-Migration-Team-Intro-Email.docx
+++ b/docs/sales/StudYear-Birmingham-Refugee-Migration-Team-Intro-Email.docx
@@ -93,7 +93,7 @@
           <w:szCs w:val="21"/>
           <w:rFonts w:ascii="Calibri" w:cs="Calibri" w:eastAsia="Calibri" w:hAnsi="Calibri"/>
         </w:rPr>
-        <w:t xml:space="preserve">A personal tutor for every migrant-background child in Birmingham — free</w:t>
+        <w:t xml:space="preserve">Not a chatbot — an AI examiner that marks your children’s work and shows the next grade</w:t>
       </w:r>
     </w:p>
     <w:p>
@@ -107,7 +107,7 @@
           <w:szCs w:val="21"/>
           <w:rFonts w:ascii="Calibri" w:cs="Calibri" w:eastAsia="Calibri" w:hAnsi="Calibri"/>
         </w:rPr>
-        <w:t xml:space="preserve">Close the gap your team fights — on a phone, at no cost to families</w:t>
+        <w:t xml:space="preserve">A personal tutor and examiner for every migrant-background child in Birmingham — free</w:t>
       </w:r>
     </w:p>
     <w:p>
@@ -121,7 +121,7 @@
           <w:szCs w:val="21"/>
           <w:rFonts w:ascii="Calibri" w:cs="Calibri" w:eastAsia="Calibri" w:hAnsi="Calibri"/>
         </w:rPr>
-        <w:t xml:space="preserve">Catch them up before they fall through — free, any phone</w:t>
+        <w:t xml:space="preserve">Close the attainment gap for the children your team supports — at no cost to families</w:t>
       </w:r>
     </w:p>
     <w:p>
@@ -153,7 +153,7 @@
           <w:szCs w:val="21"/>
           <w:rFonts w:ascii="Calibri" w:cs="Calibri" w:eastAsia="Calibri" w:hAnsi="Calibri"/>
         </w:rPr>
-        <w:t xml:space="preserve">Dear [Name],</w:t>
+        <w:t xml:space="preserve">Dear [Name / Refugee &amp; Migration Team],</w:t>
       </w:r>
     </w:p>
     <w:p>
@@ -167,8 +167,13 @@
           <w:szCs w:val="21"/>
           <w:rFonts w:ascii="Calibri" w:cs="Calibri" w:eastAsia="Calibri" w:hAnsi="Calibri"/>
         </w:rPr>
-        <w:t xml:space="preserve">Many of the children your team supports arrive mid-year between two school systems, or grow up between two languages — and too many never catch up. </w:t>
-      </w:r>
+        <w:t xml:space="preserve">Your team supports some of Birmingham’s most capable but most disrupted learners — children arriving mid-year between two education systems, and UK-born children of migrant parents who are falling through the gap at home and at school. I’d like to show you a tool that reaches them directly, for free.</w:t>
+      </w:r>
+    </w:p>
+    <w:p>
+      <w:pPr>
+        <w:spacing w:after="160" w:line="276"/>
+      </w:pPr>
       <w:r>
         <w:rPr>
           <w:b/>
@@ -178,7 +183,47 @@
           <w:szCs w:val="21"/>
           <w:rFonts w:ascii="Calibri" w:cs="Calibri" w:eastAsia="Calibri" w:hAnsi="Calibri"/>
         </w:rPr>
-        <w:t xml:space="preserve">StudYear closes that gap. Free, on any phone.</w:t>
+        <w:t xml:space="preserve">What makes StudYear different. </w:t>
+      </w:r>
+      <w:r>
+        <w:rPr>
+          <w:color w:val="1A1F2E"/>
+          <w:sz w:val="21"/>
+          <w:szCs w:val="21"/>
+          <w:rFonts w:ascii="Calibri" w:cs="Calibri" w:eastAsia="Calibri" w:hAnsi="Calibri"/>
+        </w:rPr>
+        <w:t xml:space="preserve">Most apps hand a child answers or a worksheet. StudYear is an AI </w:t>
+      </w:r>
+      <w:r>
+        <w:rPr>
+          <w:i/>
+          <w:iCs/>
+          <w:color w:val="1A1F2E"/>
+          <w:sz w:val="21"/>
+          <w:szCs w:val="21"/>
+          <w:rFonts w:ascii="Calibri" w:cs="Calibri" w:eastAsia="Calibri" w:hAnsi="Calibri"/>
+        </w:rPr>
+        <w:t xml:space="preserve">examiner</w:t>
+      </w:r>
+      <w:r>
+        <w:rPr>
+          <w:color w:val="1A1F2E"/>
+          <w:sz w:val="21"/>
+          <w:szCs w:val="21"/>
+          <w:rFonts w:ascii="Calibri" w:cs="Calibri" w:eastAsia="Calibri" w:hAnsi="Calibri"/>
+        </w:rPr>
+        <w:t xml:space="preserve">: it reads their written work, marks it for content, structure, spelling and grammar, grades it against the correct national framework, and shows them the exact next step to the grade above. </w:t>
+      </w:r>
+      <w:r>
+        <w:rPr>
+          <w:b/>
+          <w:bCs/>
+          <w:color w:val="0A1026"/>
+          <w:sz w:val="21"/>
+          <w:szCs w:val="21"/>
+          <w:rFonts w:ascii="Calibri" w:cs="Calibri" w:eastAsia="Calibri" w:hAnsi="Calibri"/>
+        </w:rPr>
+        <w:t xml:space="preserve">That is our edge — a personal tutor and examiner for every learner, in their pocket, for free.</w:t>
       </w:r>
     </w:p>
     <w:p>
@@ -192,7 +237,7 @@
           <w:szCs w:val="21"/>
           <w:rFonts w:ascii="Calibri" w:cs="Calibri" w:eastAsia="Calibri" w:hAnsi="Calibri"/>
         </w:rPr>
-        <w:t xml:space="preserve">StudYear is an AI tutor and examiner for every UK learner. Four things that matter to your families:</w:t>
+        <w:t xml:space="preserve">It matters for the children you work with because it:</w:t>
       </w:r>
     </w:p>
     <w:p>
@@ -213,16 +258,16 @@
           <w:szCs w:val="21"/>
           <w:rFonts w:ascii="Calibri" w:cs="Calibri" w:eastAsia="Calibri" w:hAnsi="Calibri"/>
         </w:rPr>
-        <w:t xml:space="preserve">Reaches anyone</w:t>
-      </w:r>
-      <w:r>
-        <w:rPr>
-          <w:color w:val="1A1F2E"/>
-          <w:sz w:val="21"/>
-          <w:szCs w:val="21"/>
-          <w:rFonts w:ascii="Calibri" w:cs="Calibri" w:eastAsia="Calibri" w:hAnsi="Calibri"/>
-        </w:rPr>
-        <w:t xml:space="preserve"> — free, any phone, no school login, whatever their status or income.</w:t>
+        <w:t xml:space="preserve">Starts free, on any phone, with no school login</w:t>
+      </w:r>
+      <w:r>
+        <w:rPr>
+          <w:color w:val="1A1F2E"/>
+          <w:sz w:val="21"/>
+          <w:szCs w:val="21"/>
+          <w:rFonts w:ascii="Calibri" w:cs="Calibri" w:eastAsia="Calibri" w:hAnsi="Calibri"/>
+        </w:rPr>
+        <w:t xml:space="preserve"> — so a family reaches it regardless of status, income or whether a school place is settled yet.</w:t>
       </w:r>
     </w:p>
     <w:p>
@@ -243,16 +288,16 @@
           <w:szCs w:val="21"/>
           <w:rFonts w:ascii="Calibri" w:cs="Calibri" w:eastAsia="Calibri" w:hAnsi="Calibri"/>
         </w:rPr>
-        <w:t xml:space="preserve">Starts at the right level</w:t>
-      </w:r>
-      <w:r>
-        <w:rPr>
-          <w:color w:val="1A1F2E"/>
-          <w:sz w:val="21"/>
-          <w:szCs w:val="21"/>
-          <w:rFonts w:ascii="Calibri" w:cs="Calibri" w:eastAsia="Calibri" w:hAnsi="Calibri"/>
-        </w:rPr>
-        <w:t xml:space="preserve"> — it teaches to the correct national framework (GCSE 9–1, A-level, BTEC, T-Level, NVQ, apprenticeships), so an older new arrival isn’t sent back to the beginning.</w:t>
+        <w:t xml:space="preserve">Meets a child at their real level and the right qualification</w:t>
+      </w:r>
+      <w:r>
+        <w:rPr>
+          <w:color w:val="1A1F2E"/>
+          <w:sz w:val="21"/>
+          <w:szCs w:val="21"/>
+          <w:rFonts w:ascii="Calibri" w:cs="Calibri" w:eastAsia="Calibri" w:hAnsi="Calibri"/>
+        </w:rPr>
+        <w:t xml:space="preserve"> — it works to the correct national framework (Primary through GCSE 9–1, A-level, BTEC, T-Level, NVQ and apprenticeships), so an older new arrival isn’t forced back to the wrong starting point.</w:t>
       </w:r>
     </w:p>
     <w:p>
@@ -273,16 +318,16 @@
           <w:szCs w:val="21"/>
           <w:rFonts w:ascii="Calibri" w:cs="Calibri" w:eastAsia="Calibri" w:hAnsi="Calibri"/>
         </w:rPr>
-        <w:t xml:space="preserve">Fixes the real gap</w:t>
-      </w:r>
-      <w:r>
-        <w:rPr>
-          <w:color w:val="1A1F2E"/>
-          <w:sz w:val="21"/>
-          <w:szCs w:val="21"/>
-          <w:rFonts w:ascii="Calibri" w:cs="Calibri" w:eastAsia="Calibri" w:hAnsi="Calibri"/>
-        </w:rPr>
-        <w:t xml:space="preserve"> — photograph a child’s handwritten work; StudYear diagnoses English, spelling and writing level and returns a step-by-step daily plan.</w:t>
+        <w:t xml:space="preserve">Targets the exact gaps new arrivals face</w:t>
+      </w:r>
+      <w:r>
+        <w:rPr>
+          <w:color w:val="1A1F2E"/>
+          <w:sz w:val="21"/>
+          <w:szCs w:val="21"/>
+          <w:rFonts w:ascii="Calibri" w:cs="Calibri" w:eastAsia="Calibri" w:hAnsi="Calibri"/>
+        </w:rPr>
+        <w:t xml:space="preserve"> — English comprehension, spelling and writing level. A parent or teacher can photograph a child’s handwritten work and StudYear reads it, diagnoses what’s holding them back, and returns a step-by-step plan with short daily practice.</w:t>
       </w:r>
     </w:p>
     <w:p>
@@ -303,16 +348,76 @@
           <w:szCs w:val="21"/>
           <w:rFonts w:ascii="Calibri" w:cs="Calibri" w:eastAsia="Calibri" w:hAnsi="Calibri"/>
         </w:rPr>
-        <w:t xml:space="preserve">Flags who’s slipping — early</w:t>
-      </w:r>
-      <w:r>
-        <w:rPr>
-          <w:color w:val="1A1F2E"/>
-          <w:sz w:val="21"/>
-          <w:szCs w:val="21"/>
-          <w:rFonts w:ascii="Calibri" w:cs="Calibri" w:eastAsia="Calibri" w:hAnsi="Calibri"/>
-        </w:rPr>
-        <w:t xml:space="preserve"> — a cohort view puts your support and funding where it counts, before a missed exam or a NEET statistic.</w:t>
+        <w:t xml:space="preserve">Brings parents in from their own phone</w:t>
+      </w:r>
+      <w:r>
+        <w:rPr>
+          <w:color w:val="1A1F2E"/>
+          <w:sz w:val="21"/>
+          <w:szCs w:val="21"/>
+          <w:rFonts w:ascii="Calibri" w:cs="Calibri" w:eastAsia="Calibri" w:hAnsi="Calibri"/>
+        </w:rPr>
+        <w:t xml:space="preserve"> — in plain progress terms, no jargon, no school portal — which helps families new to the UK system stay involved.</w:t>
+      </w:r>
+    </w:p>
+    <w:p>
+      <w:pPr>
+        <w:pStyle w:val="ListParagraph"/>
+        <w:numPr>
+          <w:ilvl w:val="0"/>
+          <w:numId w:val="2"/>
+        </w:numPr>
+        <w:spacing w:after="120" w:line="270"/>
+      </w:pPr>
+      <w:r>
+        <w:rPr>
+          <w:b/>
+          <w:bCs/>
+          <w:color w:val="0A1026"/>
+          <w:sz w:val="21"/>
+          <w:szCs w:val="21"/>
+          <w:rFonts w:ascii="Calibri" w:cs="Calibri" w:eastAsia="Calibri" w:hAnsi="Calibri"/>
+        </w:rPr>
+        <w:t xml:space="preserve">Gives your team an early-warning view</w:t>
+      </w:r>
+      <w:r>
+        <w:rPr>
+          <w:color w:val="1A1F2E"/>
+          <w:sz w:val="21"/>
+          <w:szCs w:val="21"/>
+          <w:rFonts w:ascii="Calibri" w:cs="Calibri" w:eastAsia="Calibri" w:hAnsi="Calibri"/>
+        </w:rPr>
+        <w:t xml:space="preserve"> — so support and funding land on the children slipping before it shows up as a missed exam or a NEET statistic.</w:t>
+      </w:r>
+    </w:p>
+    <w:p>
+      <w:pPr>
+        <w:pStyle w:val="ListParagraph"/>
+        <w:numPr>
+          <w:ilvl w:val="0"/>
+          <w:numId w:val="2"/>
+        </w:numPr>
+        <w:spacing w:after="120" w:line="270"/>
+      </w:pPr>
+      <w:r>
+        <w:rPr>
+          <w:b/>
+          <w:bCs/>
+          <w:color w:val="0A1026"/>
+          <w:sz w:val="21"/>
+          <w:szCs w:val="21"/>
+          <w:rFonts w:ascii="Calibri" w:cs="Calibri" w:eastAsia="Calibri" w:hAnsi="Calibri"/>
+        </w:rPr>
+        <w:t xml:space="preserve">Is safe by design</w:t>
+      </w:r>
+      <w:r>
+        <w:rPr>
+          <w:color w:val="1A1F2E"/>
+          <w:sz w:val="21"/>
+          <w:szCs w:val="21"/>
+          <w:rFonts w:ascii="Calibri" w:cs="Calibri" w:eastAsia="Calibri" w:hAnsi="Calibri"/>
+        </w:rPr>
+        <w:t xml:space="preserve"> — UK-held data, built to the Children’s Code.</w:t>
       </w:r>
     </w:p>
     <w:p>
@@ -326,7 +431,7 @@
           <w:szCs w:val="21"/>
           <w:rFonts w:ascii="Calibri" w:cs="Calibri" w:eastAsia="Calibri" w:hAnsi="Calibri"/>
         </w:rPr>
-        <w:t xml:space="preserve">Safe by design: UK-held data, built to the Children’s Code. Parents follow real progress from their own phone.</w:t>
+        <w:t xml:space="preserve">The attached brief sets out the full picture — the need, how it works, and the impact for disadvantaged and migrant-background children now and into employment.</w:t>
       </w:r>
     </w:p>
     <w:p>
@@ -340,7 +445,7 @@
           <w:szCs w:val="21"/>
           <w:rFonts w:ascii="Calibri" w:cs="Calibri" w:eastAsia="Calibri" w:hAnsi="Calibri"/>
         </w:rPr>
-        <w:t xml:space="preserve">The attached brief makes the full case. Give me </w:t>
+        <w:t xml:space="preserve">Could I show you in </w:t>
       </w:r>
       <w:r>
         <w:rPr>
@@ -360,7 +465,7 @@
           <w:szCs w:val="21"/>
           <w:rFonts w:ascii="Calibri" w:cs="Calibri" w:eastAsia="Calibri" w:hAnsi="Calibri"/>
         </w:rPr>
-        <w:t xml:space="preserve"> — no prep, no cost, no obligation. Or see it yourself first: </w:t>
+        <w:t xml:space="preserve"> — no preparation, no cost, no obligation? You can also try it yourself first at </w:t>
       </w:r>
       <w:r>
         <w:rPr>
@@ -394,7 +499,7 @@
           <w:szCs w:val="21"/>
           <w:rFonts w:ascii="Calibri" w:cs="Calibri" w:eastAsia="Calibri" w:hAnsi="Calibri"/>
         </w:rPr>
-        <w:t xml:space="preserve">With thanks for the work you do,</w:t>
+        <w:t xml:space="preserve">With thanks for the work your team does,</w:t>
       </w:r>
     </w:p>
     <w:p>

</xml_diff>